<commit_message>
added some bolding to exp/be
</commit_message>
<xml_diff>
--- a/expedia/be/fr/email.docx
+++ b/expedia/be/fr/email.docx
@@ -150,6 +150,7 @@
           <w:lang w:val="fr-BE"/>
         </w:rPr>
       </w:pPr>
+      <w:proofErr w:type="gramStart"/>
       <w:r>
         <w:rPr>
           <w:rFonts w:ascii="Arial" w:hAnsi="Arial" w:cs="Arial"/>
@@ -159,7 +160,19 @@
           <w:szCs w:val="20"/>
           <w:lang w:val="fr-BE"/>
         </w:rPr>
-        <w:t xml:space="preserve">De:       </w:t>
+        <w:t>De:</w:t>
+      </w:r>
+      <w:proofErr w:type="gramEnd"/>
+      <w:r>
+        <w:rPr>
+          <w:rFonts w:ascii="Arial" w:hAnsi="Arial" w:cs="Arial"/>
+          <w:b/>
+          <w:color w:val="FF0000"/>
+          <w:sz w:val="20"/>
+          <w:szCs w:val="20"/>
+          <w:lang w:val="fr-BE"/>
+        </w:rPr>
+        <w:t xml:space="preserve">       </w:t>
       </w:r>
       <w:del w:id="2" w:author="Francis Auquier" w:date="2026-02-11T13:14:00Z" w16du:dateUtc="2026-02-11T12:14:00Z">
         <w:r>
@@ -213,6 +226,7 @@
           <w:lang w:val="fr-BE"/>
         </w:rPr>
       </w:pPr>
+      <w:proofErr w:type="gramStart"/>
       <w:r>
         <w:rPr>
           <w:rFonts w:ascii="Arial" w:hAnsi="Arial" w:cs="Arial"/>
@@ -224,6 +238,7 @@
         </w:rPr>
         <w:t>Objet:</w:t>
       </w:r>
+      <w:proofErr w:type="gramEnd"/>
       <w:r>
         <w:rPr>
           <w:rFonts w:ascii="Arial" w:hAnsi="Arial" w:cs="Arial"/>
@@ -424,6 +439,7 @@
         </w:rPr>
         <w:t>{</w:t>
       </w:r>
+      <w:proofErr w:type="spellStart"/>
       <w:r>
         <w:rPr>
           <w:rFonts w:ascii="Arial" w:hAnsi="Arial" w:cs="Arial"/>
@@ -435,6 +451,7 @@
         </w:rPr>
         <w:t>PolicyNumber</w:t>
       </w:r>
+      <w:proofErr w:type="spellEnd"/>
       <w:r>
         <w:rPr>
           <w:rFonts w:ascii="Arial" w:hAnsi="Arial" w:cs="Arial"/>
@@ -2142,7 +2159,31 @@
                 <w:szCs w:val="24"/>
                 <w:lang w:val="fr-FR"/>
               </w:rPr>
-              <w:t xml:space="preserve">A qui m’adresser en cas de question relative à la police? </w:t>
+              <w:t xml:space="preserve">A qui m’adresser en cas de question relative à la </w:t>
+            </w:r>
+            <w:proofErr w:type="gramStart"/>
+            <w:r>
+              <w:rPr>
+                <w:rFonts w:ascii="Arial" w:eastAsia="Arial" w:hAnsi="Arial" w:cs="Arial"/>
+                <w:b/>
+                <w:color w:val="002060"/>
+                <w:sz w:val="24"/>
+                <w:szCs w:val="24"/>
+                <w:lang w:val="fr-FR"/>
+              </w:rPr>
+              <w:t>police?</w:t>
+            </w:r>
+            <w:proofErr w:type="gramEnd"/>
+            <w:r>
+              <w:rPr>
+                <w:rFonts w:ascii="Arial" w:eastAsia="Arial" w:hAnsi="Arial" w:cs="Arial"/>
+                <w:b/>
+                <w:color w:val="002060"/>
+                <w:sz w:val="24"/>
+                <w:szCs w:val="24"/>
+                <w:lang w:val="fr-FR"/>
+              </w:rPr>
+              <w:t xml:space="preserve"> </w:t>
             </w:r>
           </w:p>
           <w:p>
@@ -2180,6 +2221,7 @@
               </w:rPr>
               <w:t xml:space="preserve">Pour toute question, merci de nous appeler au </w:t>
             </w:r>
+            <w:proofErr w:type="spellStart"/>
             <w:ins w:id="87" w:author="Kitchens, Darcy" w:date="2026-02-19T16:28:00Z" w16du:dateUtc="2026-02-19T22:28:00Z">
               <w:r>
                 <w:rPr>
@@ -2188,7 +2230,17 @@
                   <w:szCs w:val="20"/>
                   <w:lang w:val="fr-FR"/>
                 </w:rPr>
-                <w:t xml:space="preserve">au </w:t>
+                <w:t>au</w:t>
+              </w:r>
+              <w:proofErr w:type="spellEnd"/>
+              <w:r>
+                <w:rPr>
+                  <w:rFonts w:ascii="Arial" w:eastAsia="Arial" w:hAnsi="Arial" w:cs="Arial"/>
+                  <w:sz w:val="20"/>
+                  <w:szCs w:val="20"/>
+                  <w:lang w:val="fr-FR"/>
+                </w:rPr>
+                <w:t xml:space="preserve"> </w:t>
               </w:r>
               <w:r>
                 <w:rPr>
@@ -2472,7 +2524,43 @@
                   <w:sz w:val="20"/>
                   <w:szCs w:val="20"/>
                 </w:rPr>
-                <w:t xml:space="preserve">Vous pouvez également </w:t>
+                <w:t xml:space="preserve">Vous </w:t>
+              </w:r>
+              <w:proofErr w:type="spellStart"/>
+              <w:r>
+                <w:rPr>
+                  <w:rFonts w:eastAsia="Arial"/>
+                  <w:sz w:val="20"/>
+                  <w:szCs w:val="20"/>
+                </w:rPr>
+                <w:t>pouvez</w:t>
+              </w:r>
+              <w:proofErr w:type="spellEnd"/>
+              <w:r>
+                <w:rPr>
+                  <w:rFonts w:eastAsia="Arial"/>
+                  <w:sz w:val="20"/>
+                  <w:szCs w:val="20"/>
+                </w:rPr>
+                <w:t xml:space="preserve"> </w:t>
+              </w:r>
+              <w:proofErr w:type="spellStart"/>
+              <w:r>
+                <w:rPr>
+                  <w:rFonts w:eastAsia="Arial"/>
+                  <w:sz w:val="20"/>
+                  <w:szCs w:val="20"/>
+                </w:rPr>
+                <w:t>également</w:t>
+              </w:r>
+              <w:proofErr w:type="spellEnd"/>
+              <w:r>
+                <w:rPr>
+                  <w:rFonts w:eastAsia="Arial"/>
+                  <w:sz w:val="20"/>
+                  <w:szCs w:val="20"/>
+                </w:rPr>
+                <w:t xml:space="preserve"> </w:t>
               </w:r>
             </w:ins>
             <w:del w:id="102" w:author="Francis Auquier" w:date="2026-02-11T12:23:00Z" w16du:dateUtc="2026-02-11T11:23:00Z">
@@ -2509,6 +2597,7 @@
                 </w:rPr>
                 <w:t>r</w:t>
               </w:r>
+              <w:proofErr w:type="spellStart"/>
               <w:r>
                 <w:rPr>
                   <w:rFonts w:eastAsia="Arial"/>
@@ -2517,6 +2606,7 @@
                 </w:rPr>
                 <w:t>emplir</w:t>
               </w:r>
+              <w:proofErr w:type="spellEnd"/>
               <w:r>
                 <w:rPr>
                   <w:rFonts w:eastAsia="Arial"/>
@@ -2732,7 +2822,32 @@
                 <w:szCs w:val="24"/>
                 <w:lang w:val="fr-FR"/>
               </w:rPr>
-              <w:t xml:space="preserve">Que faire en cas d’urgence à l’étranger? </w:t>
+              <w:lastRenderedPageBreak/>
+              <w:t xml:space="preserve">Que faire en cas d’urgence à </w:t>
+            </w:r>
+            <w:proofErr w:type="gramStart"/>
+            <w:r>
+              <w:rPr>
+                <w:rFonts w:ascii="Arial" w:eastAsia="Arial" w:hAnsi="Arial" w:cs="Arial"/>
+                <w:b/>
+                <w:color w:val="002060"/>
+                <w:sz w:val="24"/>
+                <w:szCs w:val="24"/>
+                <w:lang w:val="fr-FR"/>
+              </w:rPr>
+              <w:t>l’étranger?</w:t>
+            </w:r>
+            <w:proofErr w:type="gramEnd"/>
+            <w:r>
+              <w:rPr>
+                <w:rFonts w:ascii="Arial" w:eastAsia="Arial" w:hAnsi="Arial" w:cs="Arial"/>
+                <w:b/>
+                <w:color w:val="002060"/>
+                <w:sz w:val="24"/>
+                <w:szCs w:val="24"/>
+                <w:lang w:val="fr-FR"/>
+              </w:rPr>
+              <w:t xml:space="preserve"> </w:t>
             </w:r>
           </w:p>
           <w:p>
@@ -2954,6 +3069,7 @@
               </w:rPr>
               <w:t xml:space="preserve">Comment déclarer un </w:t>
             </w:r>
+            <w:proofErr w:type="spellStart"/>
             <w:r>
               <w:rPr>
                 <w:rFonts w:ascii="Arial" w:eastAsia="Arial" w:hAnsi="Arial" w:cs="Arial"/>
@@ -2977,6 +3093,7 @@
                 </w:rPr>
                 <w:t>r</w:t>
               </w:r>
+              <w:proofErr w:type="spellEnd"/>
               <w:r>
                 <w:rPr>
                   <w:rFonts w:eastAsia="Arial"/>
@@ -3089,8 +3206,9 @@
                   </w:rPr>
                 </w:rPrChange>
               </w:rPr>
-              <w:t>e sinistre à l’adresse suivante</w:t>
+              <w:t xml:space="preserve">e sinistre à l’adresse </w:t>
             </w:r>
+            <w:proofErr w:type="gramStart"/>
             <w:r>
               <w:rPr>
                 <w:sz w:val="20"/>
@@ -3104,9 +3222,40 @@
                   </w:rPr>
                 </w:rPrChange>
               </w:rPr>
-              <w:t xml:space="preserve">: </w:t>
+              <w:t>suivante</w:t>
             </w:r>
-            <w:ins w:id="127" w:author="Kitchens, Darcy" w:date="2026-03-02T17:59:00Z">
+            <w:r>
+              <w:rPr>
+                <w:sz w:val="20"/>
+                <w:szCs w:val="20"/>
+                <w:lang w:val="fr-FR"/>
+                <w:rPrChange w:id="127" w:author="Alexandra Stamp" w:date="2026-03-04T14:48:00Z" w16du:dateUtc="2026-03-04T14:48:00Z">
+                  <w:rPr>
+                    <w:sz w:val="20"/>
+                    <w:szCs w:val="20"/>
+                    <w:lang w:val="it-IT"/>
+                  </w:rPr>
+                </w:rPrChange>
+              </w:rPr>
+              <w:t>:</w:t>
+            </w:r>
+            <w:proofErr w:type="gramEnd"/>
+            <w:r>
+              <w:rPr>
+                <w:sz w:val="20"/>
+                <w:szCs w:val="20"/>
+                <w:lang w:val="fr-FR"/>
+                <w:rPrChange w:id="128" w:author="Alexandra Stamp" w:date="2026-03-04T14:48:00Z" w16du:dateUtc="2026-03-04T14:48:00Z">
+                  <w:rPr>
+                    <w:sz w:val="20"/>
+                    <w:szCs w:val="20"/>
+                    <w:lang w:val="it-IT"/>
+                  </w:rPr>
+                </w:rPrChange>
+              </w:rPr>
+              <w:t xml:space="preserve"> </w:t>
+            </w:r>
+            <w:ins w:id="129" w:author="Kitchens, Darcy" w:date="2026-03-02T17:59:00Z">
               <w:r>
                 <w:rPr>
                   <w:sz w:val="20"/>
@@ -3119,7 +3268,7 @@
                   <w:sz w:val="20"/>
                   <w:szCs w:val="20"/>
                   <w:lang w:val="fr-FR"/>
-                  <w:rPrChange w:id="128" w:author="Alexandra Stamp" w:date="2026-03-04T14:48:00Z" w16du:dateUtc="2026-03-04T14:48:00Z">
+                  <w:rPrChange w:id="130" w:author="Alexandra Stamp" w:date="2026-03-04T14:48:00Z" w16du:dateUtc="2026-03-04T14:48:00Z">
                     <w:rPr>
                       <w:sz w:val="20"/>
                       <w:szCs w:val="20"/>
@@ -3147,7 +3296,7 @@
                   <w:sz w:val="20"/>
                   <w:szCs w:val="20"/>
                   <w:lang w:val="fr-FR"/>
-                  <w:rPrChange w:id="129" w:author="Alexandra Stamp" w:date="2026-03-04T14:48:00Z" w16du:dateUtc="2026-03-04T14:48:00Z">
+                  <w:rPrChange w:id="131" w:author="Alexandra Stamp" w:date="2026-03-04T14:48:00Z" w16du:dateUtc="2026-03-04T14:48:00Z">
                     <w:rPr>
                       <w:rStyle w:val="Hyperlink"/>
                       <w:sz w:val="20"/>
@@ -3159,7 +3308,7 @@
                 <w:t>https://claims.travelguard.com/myclaim/be</w:t>
               </w:r>
             </w:ins>
-            <w:ins w:id="130" w:author="Kitchens, Darcy" w:date="2026-03-02T17:59:00Z" w16du:dateUtc="2026-03-02T23:59:00Z">
+            <w:ins w:id="132" w:author="Kitchens, Darcy" w:date="2026-03-02T17:59:00Z" w16du:dateUtc="2026-03-02T23:59:00Z">
               <w:r>
                 <w:rPr>
                   <w:sz w:val="20"/>
@@ -3169,45 +3318,7 @@
                 <w:fldChar w:fldCharType="end"/>
               </w:r>
             </w:ins>
-            <w:del w:id="131" w:author="Kitchens, Darcy" w:date="2026-02-19T16:31:00Z" w16du:dateUtc="2026-02-19T22:31:00Z">
-              <w:r>
-                <w:rPr>
-                  <w:rFonts w:ascii="Arial" w:hAnsi="Arial" w:cs="Arial"/>
-                  <w:b/>
-                  <w:bCs/>
-                  <w:sz w:val="20"/>
-                  <w:szCs w:val="20"/>
-                  <w:u w:val="single"/>
-                  <w:lang w:val="fr-FR"/>
-                  <w:rPrChange w:id="132" w:author="Alexandra Stamp" w:date="2026-03-04T14:48:00Z" w16du:dateUtc="2026-03-04T14:48:00Z">
-                    <w:rPr>
-                      <w:rFonts w:ascii="Arial" w:hAnsi="Arial" w:cs="Arial"/>
-                      <w:b/>
-                      <w:bCs/>
-                      <w:sz w:val="20"/>
-                      <w:szCs w:val="20"/>
-                      <w:u w:val="single"/>
-                    </w:rPr>
-                  </w:rPrChange>
-                </w:rPr>
-                <w:delText>{Claims URL}</w:delText>
-              </w:r>
-              <w:r>
-                <w:rPr>
-                  <w:rFonts w:ascii="Arial" w:hAnsi="Arial" w:cs="Arial"/>
-                  <w:sz w:val="20"/>
-                  <w:szCs w:val="20"/>
-                  <w:lang w:val="fr-FR"/>
-                  <w:rPrChange w:id="133" w:author="Alexandra Stamp" w:date="2026-03-04T14:48:00Z" w16du:dateUtc="2026-03-04T14:48:00Z">
-                    <w:rPr>
-                      <w:rFonts w:ascii="Arial" w:hAnsi="Arial" w:cs="Arial"/>
-                      <w:sz w:val="20"/>
-                      <w:szCs w:val="20"/>
-                    </w:rPr>
-                  </w:rPrChange>
-                </w:rPr>
-                <w:delText xml:space="preserve">. </w:delText>
-              </w:r>
+            <w:del w:id="133" w:author="Kitchens, Darcy" w:date="2026-02-19T16:31:00Z" w16du:dateUtc="2026-02-19T22:31:00Z">
               <w:r>
                 <w:rPr>
                   <w:rFonts w:ascii="Arial" w:hAnsi="Arial" w:cs="Arial"/>
@@ -3228,6 +3339,44 @@
                     </w:rPr>
                   </w:rPrChange>
                 </w:rPr>
+                <w:delText>{Claims URL}</w:delText>
+              </w:r>
+              <w:r>
+                <w:rPr>
+                  <w:rFonts w:ascii="Arial" w:hAnsi="Arial" w:cs="Arial"/>
+                  <w:sz w:val="20"/>
+                  <w:szCs w:val="20"/>
+                  <w:lang w:val="fr-FR"/>
+                  <w:rPrChange w:id="135" w:author="Alexandra Stamp" w:date="2026-03-04T14:48:00Z" w16du:dateUtc="2026-03-04T14:48:00Z">
+                    <w:rPr>
+                      <w:rFonts w:ascii="Arial" w:hAnsi="Arial" w:cs="Arial"/>
+                      <w:sz w:val="20"/>
+                      <w:szCs w:val="20"/>
+                    </w:rPr>
+                  </w:rPrChange>
+                </w:rPr>
+                <w:delText xml:space="preserve">. </w:delText>
+              </w:r>
+              <w:r>
+                <w:rPr>
+                  <w:rFonts w:ascii="Arial" w:hAnsi="Arial" w:cs="Arial"/>
+                  <w:b/>
+                  <w:bCs/>
+                  <w:sz w:val="20"/>
+                  <w:szCs w:val="20"/>
+                  <w:u w:val="single"/>
+                  <w:lang w:val="fr-FR"/>
+                  <w:rPrChange w:id="136" w:author="Alexandra Stamp" w:date="2026-03-04T14:48:00Z" w16du:dateUtc="2026-03-04T14:48:00Z">
+                    <w:rPr>
+                      <w:rFonts w:ascii="Arial" w:hAnsi="Arial" w:cs="Arial"/>
+                      <w:b/>
+                      <w:bCs/>
+                      <w:sz w:val="20"/>
+                      <w:szCs w:val="20"/>
+                      <w:u w:val="single"/>
+                    </w:rPr>
+                  </w:rPrChange>
+                </w:rPr>
                 <w:delText xml:space="preserve"> </w:delText>
               </w:r>
             </w:del>
@@ -3299,7 +3448,27 @@
           <w:szCs w:val="20"/>
           <w:lang w:val="fr-FR"/>
         </w:rPr>
-        <w:t xml:space="preserve">Bon voyage! </w:t>
+        <w:t xml:space="preserve">Bon </w:t>
+      </w:r>
+      <w:proofErr w:type="gramStart"/>
+      <w:r>
+        <w:rPr>
+          <w:rFonts w:ascii="Arial" w:eastAsia="Arial" w:hAnsi="Arial" w:cs="Arial"/>
+          <w:sz w:val="20"/>
+          <w:szCs w:val="20"/>
+          <w:lang w:val="fr-FR"/>
+        </w:rPr>
+        <w:t>voyage!</w:t>
+      </w:r>
+      <w:proofErr w:type="gramEnd"/>
+      <w:r>
+        <w:rPr>
+          <w:rFonts w:ascii="Arial" w:eastAsia="Arial" w:hAnsi="Arial" w:cs="Arial"/>
+          <w:sz w:val="20"/>
+          <w:szCs w:val="20"/>
+          <w:lang w:val="fr-FR"/>
+        </w:rPr>
+        <w:t xml:space="preserve"> </w:t>
       </w:r>
       <w:r>
         <w:rPr>
@@ -3310,7 +3479,7 @@
         </w:rPr>
         <w:br/>
       </w:r>
-      <w:del w:id="135" w:author="Emeline Jamoul" w:date="2026-02-09T16:34:00Z" w16du:dateUtc="2026-02-09T12:34:00Z">
+      <w:del w:id="137" w:author="Emeline Jamoul" w:date="2026-02-09T16:34:00Z" w16du:dateUtc="2026-02-09T12:34:00Z">
         <w:r>
           <w:rPr>
             <w:rFonts w:ascii="Arial" w:hAnsi="Arial" w:cs="Arial"/>
@@ -3319,7 +3488,7 @@
             <w:sz w:val="20"/>
             <w:szCs w:val="20"/>
             <w:lang w:val="en-AU"/>
-            <w:rPrChange w:id="136" w:author="Uy, Eleanor" w:date="2021-02-19T15:00:00Z">
+            <w:rPrChange w:id="138" w:author="Uy, Eleanor" w:date="2021-02-19T15:00:00Z">
               <w:rPr>
                 <w:rFonts w:ascii="Arial" w:hAnsi="Arial" w:cs="Arial"/>
                 <w:b/>
@@ -3333,7 +3502,7 @@
           <w:delText>AIG Travel</w:delText>
         </w:r>
       </w:del>
-      <w:ins w:id="137" w:author="Emeline Jamoul" w:date="2026-02-09T16:34:00Z" w16du:dateUtc="2026-02-09T12:34:00Z">
+      <w:ins w:id="139" w:author="Emeline Jamoul" w:date="2026-02-09T16:34:00Z" w16du:dateUtc="2026-02-09T12:34:00Z">
         <w:r>
           <w:rPr>
             <w:rFonts w:ascii="Arial" w:hAnsi="Arial" w:cs="Arial"/>
@@ -3346,7 +3515,7 @@
           <w:t>Tra</w:t>
         </w:r>
       </w:ins>
-      <w:ins w:id="138" w:author="Emeline Jamoul" w:date="2026-02-09T16:35:00Z" w16du:dateUtc="2026-02-09T12:35:00Z">
+      <w:ins w:id="140" w:author="Emeline Jamoul" w:date="2026-02-09T16:35:00Z" w16du:dateUtc="2026-02-09T12:35:00Z">
         <w:r>
           <w:rPr>
             <w:rFonts w:ascii="Arial" w:hAnsi="Arial" w:cs="Arial"/>
@@ -6511,34 +6680,6 @@
 </file>
 
 <file path=customXml/item1.xml><?xml version="1.0" encoding="utf-8"?>
-<?mso-contentType ?>
-<FormTemplates xmlns="http://schemas.microsoft.com/sharepoint/v3/contenttype/forms">
-  <Display>DocumentLibraryForm</Display>
-  <Edit>DocumentLibraryForm</Edit>
-  <New>DocumentLibraryForm</New>
-</FormTemplates>
-</file>
-
-<file path=customXml/item2.xml><?xml version="1.0" encoding="utf-8"?>
-<p:properties xmlns:p="http://schemas.microsoft.com/office/2006/metadata/properties" xmlns:xsi="http://www.w3.org/2001/XMLSchema-instance" xmlns:pc="http://schemas.microsoft.com/office/infopath/2007/PartnerControls">
-  <documentManagement>
-    <_ip_UnifiedCompliancePolicyUIAction xmlns="http://schemas.microsoft.com/sharepoint/v3" xsi:nil="true"/>
-    <RevisionDate xmlns="694a2687-4383-4267-b4dc-f7657eaaabf8" xsi:nil="true"/>
-    <TaxCatchAll xmlns="e42673de-b264-43ab-b333-25166615ddcb" xsi:nil="true"/>
-    <Country xmlns="694a2687-4383-4267-b4dc-f7657eaaabf8" xsi:nil="true"/>
-    <Date xmlns="694a2687-4383-4267-b4dc-f7657eaaabf8" xsi:nil="true"/>
-    <Comments xmlns="694a2687-4383-4267-b4dc-f7657eaaabf8" xsi:nil="true"/>
-    <_ip_UnifiedCompliancePolicyProperties xmlns="http://schemas.microsoft.com/sharepoint/v3" xsi:nil="true"/>
-    <lcf76f155ced4ddcb4097134ff3c332f xmlns="694a2687-4383-4267-b4dc-f7657eaaabf8">
-      <Terms xmlns="http://schemas.microsoft.com/office/infopath/2007/PartnerControls"/>
-    </lcf76f155ced4ddcb4097134ff3c332f>
-    <Language xmlns="694a2687-4383-4267-b4dc-f7657eaaabf8" xsi:nil="true"/>
-    <DocumentType xmlns="694a2687-4383-4267-b4dc-f7657eaaabf8" xsi:nil="true"/>
-  </documentManagement>
-</p:properties>
-</file>
-
-<file path=customXml/item3.xml><?xml version="1.0" encoding="utf-8"?>
 <ct:contentTypeSchema xmlns:ct="http://schemas.microsoft.com/office/2006/metadata/contentType" xmlns:ma="http://schemas.microsoft.com/office/2006/metadata/properties/metaAttributes" ct:_="" ma:_="" ma:contentTypeName="Document" ma:contentTypeID="0x0101005B114DE0BF701045AD2403C163A63BBD" ma:contentTypeVersion="24" ma:contentTypeDescription="Create a new document." ma:contentTypeScope="" ma:versionID="d22f1679e070d80fde07c0aa1e02a1d7">
   <xsd:schema xmlns:xsd="http://www.w3.org/2001/XMLSchema" xmlns:xs="http://www.w3.org/2001/XMLSchema" xmlns:p="http://schemas.microsoft.com/office/2006/metadata/properties" xmlns:ns1="http://schemas.microsoft.com/sharepoint/v3" xmlns:ns2="694a2687-4383-4267-b4dc-f7657eaaabf8" xmlns:ns3="e42673de-b264-43ab-b333-25166615ddcb" targetNamespace="http://schemas.microsoft.com/office/2006/metadata/properties" ma:root="true" ma:fieldsID="a4304071a50c429e02536ead82bdb62a" ns1:_="" ns2:_="" ns3:_="">
     <xsd:import namespace="http://schemas.microsoft.com/sharepoint/v3"/>
@@ -6842,10 +6983,50 @@
 </ct:contentTypeSchema>
 </file>
 
+<file path=customXml/item2.xml><?xml version="1.0" encoding="utf-8"?>
+<p:properties xmlns:p="http://schemas.microsoft.com/office/2006/metadata/properties" xmlns:xsi="http://www.w3.org/2001/XMLSchema-instance" xmlns:pc="http://schemas.microsoft.com/office/infopath/2007/PartnerControls">
+  <documentManagement>
+    <_ip_UnifiedCompliancePolicyUIAction xmlns="http://schemas.microsoft.com/sharepoint/v3" xsi:nil="true"/>
+    <RevisionDate xmlns="694a2687-4383-4267-b4dc-f7657eaaabf8" xsi:nil="true"/>
+    <TaxCatchAll xmlns="e42673de-b264-43ab-b333-25166615ddcb" xsi:nil="true"/>
+    <Country xmlns="694a2687-4383-4267-b4dc-f7657eaaabf8" xsi:nil="true"/>
+    <Date xmlns="694a2687-4383-4267-b4dc-f7657eaaabf8" xsi:nil="true"/>
+    <Comments xmlns="694a2687-4383-4267-b4dc-f7657eaaabf8" xsi:nil="true"/>
+    <_ip_UnifiedCompliancePolicyProperties xmlns="http://schemas.microsoft.com/sharepoint/v3" xsi:nil="true"/>
+    <lcf76f155ced4ddcb4097134ff3c332f xmlns="694a2687-4383-4267-b4dc-f7657eaaabf8">
+      <Terms xmlns="http://schemas.microsoft.com/office/infopath/2007/PartnerControls"/>
+    </lcf76f155ced4ddcb4097134ff3c332f>
+    <Language xmlns="694a2687-4383-4267-b4dc-f7657eaaabf8" xsi:nil="true"/>
+    <DocumentType xmlns="694a2687-4383-4267-b4dc-f7657eaaabf8" xsi:nil="true"/>
+  </documentManagement>
+</p:properties>
+</file>
+
+<file path=customXml/item3.xml><?xml version="1.0" encoding="utf-8"?>
+<?mso-contentType ?>
+<FormTemplates xmlns="http://schemas.microsoft.com/sharepoint/v3/contenttype/forms">
+  <Display>DocumentLibraryForm</Display>
+  <Edit>DocumentLibraryForm</Edit>
+  <New>DocumentLibraryForm</New>
+</FormTemplates>
+</file>
+
 <file path=customXml/itemProps1.xml><?xml version="1.0" encoding="utf-8"?>
-<ds:datastoreItem xmlns:ds="http://schemas.openxmlformats.org/officeDocument/2006/customXml" ds:itemID="{ACFEA371-4173-4094-89F7-4EBC9147FFBC}">
+<ds:datastoreItem xmlns:ds="http://schemas.openxmlformats.org/officeDocument/2006/customXml" ds:itemID="{FA22F709-B431-4272-9D1B-30DE5938B125}">
   <ds:schemaRefs>
-    <ds:schemaRef ds:uri="http://schemas.microsoft.com/sharepoint/v3/contenttype/forms"/>
+    <ds:schemaRef ds:uri="http://schemas.microsoft.com/office/2006/metadata/contentType"/>
+    <ds:schemaRef ds:uri="http://schemas.microsoft.com/office/2006/metadata/properties/metaAttributes"/>
+    <ds:schemaRef ds:uri="http://www.w3.org/2001/XMLSchema"/>
+    <ds:schemaRef ds:uri="http://schemas.microsoft.com/office/2006/metadata/properties"/>
+    <ds:schemaRef ds:uri="http://schemas.microsoft.com/sharepoint/v3"/>
+    <ds:schemaRef ds:uri="694a2687-4383-4267-b4dc-f7657eaaabf8"/>
+    <ds:schemaRef ds:uri="e42673de-b264-43ab-b333-25166615ddcb"/>
+    <ds:schemaRef ds:uri="http://schemas.microsoft.com/office/2006/documentManagement/types"/>
+    <ds:schemaRef ds:uri="http://schemas.microsoft.com/office/infopath/2007/PartnerControls"/>
+    <ds:schemaRef ds:uri="http://schemas.openxmlformats.org/package/2006/metadata/core-properties"/>
+    <ds:schemaRef ds:uri="http://purl.org/dc/elements/1.1/"/>
+    <ds:schemaRef ds:uri="http://purl.org/dc/terms/"/>
+    <ds:schemaRef ds:uri="http://schemas.microsoft.com/internal/obd"/>
   </ds:schemaRefs>
 </ds:datastoreItem>
 </file>
@@ -6863,21 +7044,9 @@
 </file>
 
 <file path=customXml/itemProps3.xml><?xml version="1.0" encoding="utf-8"?>
-<ds:datastoreItem xmlns:ds="http://schemas.openxmlformats.org/officeDocument/2006/customXml" ds:itemID="{FA22F709-B431-4272-9D1B-30DE5938B125}">
+<ds:datastoreItem xmlns:ds="http://schemas.openxmlformats.org/officeDocument/2006/customXml" ds:itemID="{ACFEA371-4173-4094-89F7-4EBC9147FFBC}">
   <ds:schemaRefs>
-    <ds:schemaRef ds:uri="http://schemas.microsoft.com/office/2006/metadata/contentType"/>
-    <ds:schemaRef ds:uri="http://schemas.microsoft.com/office/2006/metadata/properties/metaAttributes"/>
-    <ds:schemaRef ds:uri="http://www.w3.org/2001/XMLSchema"/>
-    <ds:schemaRef ds:uri="http://schemas.microsoft.com/office/2006/metadata/properties"/>
-    <ds:schemaRef ds:uri="http://schemas.microsoft.com/sharepoint/v3"/>
-    <ds:schemaRef ds:uri="694a2687-4383-4267-b4dc-f7657eaaabf8"/>
-    <ds:schemaRef ds:uri="e42673de-b264-43ab-b333-25166615ddcb"/>
-    <ds:schemaRef ds:uri="http://schemas.microsoft.com/office/2006/documentManagement/types"/>
-    <ds:schemaRef ds:uri="http://schemas.microsoft.com/office/infopath/2007/PartnerControls"/>
-    <ds:schemaRef ds:uri="http://schemas.openxmlformats.org/package/2006/metadata/core-properties"/>
-    <ds:schemaRef ds:uri="http://purl.org/dc/elements/1.1/"/>
-    <ds:schemaRef ds:uri="http://purl.org/dc/terms/"/>
-    <ds:schemaRef ds:uri="http://schemas.microsoft.com/internal/obd"/>
+    <ds:schemaRef ds:uri="http://schemas.microsoft.com/sharepoint/v3/contenttype/forms"/>
   </ds:schemaRefs>
 </ds:datastoreItem>
 </file>
</xml_diff>